<commit_message>
update with 1.1 versions
</commit_message>
<xml_diff>
--- a/belonging-policy.docx
+++ b/belonging-policy.docx
@@ -56,13 +56,7 @@
           <w:rFonts w:ascii="Arial" w:cs="Arial" w:eastAsia="Arial" w:hAnsi="Arial"/>
           <w:rtl w:val="0"/>
         </w:rPr>
-        <w:t xml:space="preserve">Approval Date: 2025-06-03</w:t>
-        <w:br w:type="textWrapping"/>
-        <w:t xml:space="preserve">Effective Date: 2025-06-03</w:t>
-        <w:br w:type="textWrapping"/>
-        <w:t xml:space="preserve">Version: 1.0</w:t>
-        <w:br w:type="textWrapping"/>
-        <w:t xml:space="preserve">Approved by: Interim Council</w:t>
+        <w:t xml:space="preserve">Approval Date: 2025-09-04 • Effective Date: 2025-06-03 • Version: 1.1 • Approved by: Interim Council</w:t>
       </w:r>
       <w:r>
         <w:rPr>
@@ -751,7 +745,7 @@
           <w:rFonts w:ascii="Arial" w:cs="Arial" w:eastAsia="Arial" w:hAnsi="Arial"/>
           <w:rtl w:val="0"/>
         </w:rPr>
-        <w:t xml:space="preserve">RIIS 2.0 and its officers, directors, Affiliates, employees, and persons served by RIIS 2.0 shall be selected in a fair manner, taking into account the Legal Foundation in the </w:t>
+        <w:t xml:space="preserve">RIIS 2.0 and its officers, directors, Affiliates, employees, and persons served by RIIS 2.0 shall be selected in a fair manner, taking into account the legal foundation in the </w:t>
       </w:r>
       <w:hyperlink r:id="rId6">
         <w:r>
@@ -832,7 +826,23 @@
           <w:szCs w:val="24"/>
           <w:rtl w:val="0"/>
         </w:rPr>
-        <w:t xml:space="preserve">believes everyone has the right to work in a professional environment where their knowledge, skills, and abilities are</w:t>
+        <w:t xml:space="preserve">believes everyone has the </w:t>
+      </w:r>
+      <w:r>
+        <w:rPr>
+          <w:rFonts w:ascii="Arial" w:cs="Arial" w:eastAsia="Arial" w:hAnsi="Arial"/>
+          <w:rtl w:val="0"/>
+        </w:rPr>
+        <w:t xml:space="preserve">expectation</w:t>
+      </w:r>
+      <w:r>
+        <w:rPr>
+          <w:rFonts w:ascii="Arial" w:cs="Arial" w:eastAsia="Arial" w:hAnsi="Arial"/>
+          <w:sz w:val="24"/>
+          <w:szCs w:val="24"/>
+          <w:rtl w:val="0"/>
+        </w:rPr>
+        <w:t xml:space="preserve"> to work in a professional environment where their knowledge, skills, and abilities are</w:t>
       </w:r>
       <w:r>
         <w:rPr>
@@ -1130,7 +1140,7 @@
           <w:rFonts w:ascii="Arial" w:cs="Arial" w:eastAsia="Arial" w:hAnsi="Arial"/>
           <w:rtl w:val="0"/>
         </w:rPr>
-        <w:t xml:space="preserve">Date: 2025-06-03</w:t>
+        <w:t xml:space="preserve">Date: 2025-09-04</w:t>
       </w:r>
       <w:r>
         <w:rPr>
@@ -1259,6 +1269,26 @@
           <w:ilvl w:val="0"/>
           <w:numId w:val="1"/>
         </w:numPr>
+        <w:spacing w:after="0" w:afterAutospacing="0" w:before="0" w:beforeAutospacing="0" w:line="276" w:lineRule="auto"/>
+        <w:ind w:left="720" w:hanging="360"/>
+        <w:rPr>
+          <w:rFonts w:ascii="Arial" w:cs="Arial" w:eastAsia="Arial" w:hAnsi="Arial"/>
+        </w:rPr>
+      </w:pPr>
+      <w:r>
+        <w:rPr>
+          <w:rFonts w:ascii="Arial" w:cs="Arial" w:eastAsia="Arial" w:hAnsi="Arial"/>
+          <w:rtl w:val="0"/>
+        </w:rPr>
+        <w:t xml:space="preserve">May 28, 2025: Revised by Arika Virapongse, Jovita De Loatch, Rami Saydjari, Alex Lancaster, Keith Tse, Herbert J. Bernstein (Affiliation Working Group) (Version 1.0)</w:t>
+      </w:r>
+    </w:p>
+    <w:p>
+      <w:pPr>
+        <w:numPr>
+          <w:ilvl w:val="0"/>
+          <w:numId w:val="1"/>
+        </w:numPr>
         <w:spacing w:after="200" w:before="0" w:beforeAutospacing="0" w:line="276" w:lineRule="auto"/>
         <w:ind w:left="720" w:hanging="360"/>
         <w:rPr>
@@ -1270,7 +1300,12 @@
           <w:rFonts w:ascii="Arial" w:cs="Arial" w:eastAsia="Arial" w:hAnsi="Arial"/>
           <w:rtl w:val="0"/>
         </w:rPr>
-        <w:t xml:space="preserve">May 28, 2025: Revised by Arika Virapongse, Jovita De Loatch, Rami Saydjari, Alex Lancaster, Keith Tse, Herbert J. Bernstein (Affiliation Working Group)</w:t>
+        <w:t xml:space="preserve">September 3, 2025: Draft revised by Interim Council following pro-bono legal review (Version 1.1)</w:t>
+      </w:r>
+      <w:r>
+        <w:rPr>
+          <w:rtl w:val="0"/>
+        </w:rPr>
       </w:r>
     </w:p>
     <w:p>
@@ -1430,11 +1465,19 @@
       </w:pPr>
     </w:pPrDefault>
   </w:docDefaults>
+  <w:style w:type="table" w:styleId="TableNormal" w:default="1">
+    <w:name w:val="TableNormal"/>
+    <w:tblPr>
+      <w:tblCellMar>
+        <w:top w:w="100.0" w:type="dxa"/>
+        <w:left w:w="100.0" w:type="dxa"/>
+        <w:bottom w:w="100.0" w:type="dxa"/>
+        <w:right w:w="100.0" w:type="dxa"/>
+      </w:tblCellMar>
+    </w:tblPr>
+  </w:style>
   <w:style w:type="paragraph" w:styleId="Normal" w:default="1">
     <w:name w:val="normal"/>
-  </w:style>
-  <w:style w:type="table" w:styleId="TableNormal" w:default="1">
-    <w:name w:val="TableNormal"/>
   </w:style>
   <w:style w:type="paragraph" w:styleId="Heading1">
     <w:name w:val="heading 1"/>
@@ -1572,12 +1615,7 @@
     <w:tblPr>
       <w:tblStyleRowBandSize w:val="1"/>
       <w:tblStyleColBandSize w:val="1"/>
-      <w:tblCellMar>
-        <w:top w:w="100.0" w:type="dxa"/>
-        <w:left w:w="100.0" w:type="dxa"/>
-        <w:bottom w:w="100.0" w:type="dxa"/>
-        <w:right w:w="100.0" w:type="dxa"/>
-      </w:tblCellMar>
+      <w:tblCellMar/>
     </w:tblPr>
     <w:tblStylePr w:type="band1Horz">
       <w:tcPr/>

</xml_diff>